<commit_message>
testing different data collection strategies
</commit_message>
<xml_diff>
--- a/calibration_apriltags.docx
+++ b/calibration_apriltags.docx
@@ -244,6 +244,9 @@
         </w:drawing>
       </w:r>
       <w:r>
+        <w:rPr>
+          <w:noProof/>
+        </w:rPr>
         <w:drawing>
           <wp:anchor distT="0" distB="0" distL="114300" distR="114300" simplePos="0" relativeHeight="251665408" behindDoc="0" locked="0" layoutInCell="1" allowOverlap="1" wp14:anchorId="03E06FFF" wp14:editId="6242CDD7">
             <wp:simplePos x="0" y="0"/>
@@ -301,6 +304,9 @@
         </w:drawing>
       </w:r>
       <w:r>
+        <w:rPr>
+          <w:noProof/>
+        </w:rPr>
         <w:drawing>
           <wp:anchor distT="0" distB="0" distL="114300" distR="114300" simplePos="0" relativeHeight="251663360" behindDoc="0" locked="0" layoutInCell="1" allowOverlap="1" wp14:anchorId="2433DF78" wp14:editId="0069F95C">
             <wp:simplePos x="0" y="0"/>
@@ -432,18 +438,18 @@
         </w:rPr>
         <w:lastRenderedPageBreak/>
         <w:drawing>
-          <wp:anchor distT="0" distB="0" distL="114300" distR="114300" simplePos="0" relativeHeight="251677696" behindDoc="0" locked="0" layoutInCell="1" allowOverlap="1" wp14:anchorId="46B1551F" wp14:editId="606E17C3">
+          <wp:anchor distT="0" distB="0" distL="114300" distR="114300" simplePos="0" relativeHeight="251679744" behindDoc="0" locked="0" layoutInCell="1" allowOverlap="1" wp14:anchorId="47B0A819" wp14:editId="473D5388">
             <wp:simplePos x="0" y="0"/>
-            <wp:positionH relativeFrom="column">
-              <wp:posOffset>3730844</wp:posOffset>
+            <wp:positionH relativeFrom="margin">
+              <wp:align>left</wp:align>
             </wp:positionH>
             <wp:positionV relativeFrom="paragraph">
-              <wp:posOffset>2154380</wp:posOffset>
+              <wp:posOffset>1270</wp:posOffset>
             </wp:positionV>
-            <wp:extent cx="1440000" cy="1440000"/>
-            <wp:effectExtent l="0" t="0" r="8255" b="8255"/>
+            <wp:extent cx="2160000" cy="2160000"/>
+            <wp:effectExtent l="0" t="0" r="0" b="0"/>
             <wp:wrapSquare wrapText="bothSides"/>
-            <wp:docPr id="15" name="Graphic 15"/>
+            <wp:docPr id="16" name="Graphic 16"/>
             <wp:cNvGraphicFramePr>
               <a:graphicFrameLocks xmlns:a="http://schemas.openxmlformats.org/drawingml/2006/main" noChangeAspect="1"/>
             </wp:cNvGraphicFramePr>
@@ -469,7 +475,7 @@
                   <pic:spPr>
                     <a:xfrm>
                       <a:off x="0" y="0"/>
-                      <a:ext cx="1440000" cy="1440000"/>
+                      <a:ext cx="2159635" cy="2159635"/>
                     </a:xfrm>
                     <a:prstGeom prst="rect">
                       <a:avLst/>
@@ -478,92 +484,34 @@
                 </pic:pic>
               </a:graphicData>
             </a:graphic>
-            <wp14:sizeRelH relativeFrom="margin">
-              <wp14:pctWidth>0</wp14:pctWidth>
-            </wp14:sizeRelH>
-            <wp14:sizeRelV relativeFrom="margin">
-              <wp14:pctHeight>0</wp14:pctHeight>
-            </wp14:sizeRelV>
           </wp:anchor>
         </w:drawing>
       </w:r>
+    </w:p>
+    <w:p>
+      <w:r>
+        <w:br w:type="page"/>
+      </w:r>
+    </w:p>
+    <w:p>
       <w:r>
         <w:rPr>
           <w:noProof/>
         </w:rPr>
+        <w:lastRenderedPageBreak/>
         <w:drawing>
-          <wp:anchor distT="0" distB="0" distL="114300" distR="114300" simplePos="0" relativeHeight="251675648" behindDoc="0" locked="0" layoutInCell="1" allowOverlap="1" wp14:anchorId="6F64D192" wp14:editId="4F42A75C">
+          <wp:anchor distT="0" distB="0" distL="114300" distR="114300" simplePos="0" relativeHeight="251658240" behindDoc="0" locked="0" layoutInCell="1" allowOverlap="1" wp14:anchorId="2F77FACB" wp14:editId="2A6C1E09">
             <wp:simplePos x="0" y="0"/>
-            <wp:positionH relativeFrom="column">
-              <wp:posOffset>409904</wp:posOffset>
+            <wp:positionH relativeFrom="margin">
+              <wp:align>left</wp:align>
             </wp:positionH>
             <wp:positionV relativeFrom="paragraph">
-              <wp:posOffset>2166554</wp:posOffset>
+              <wp:posOffset>6067184</wp:posOffset>
             </wp:positionV>
-            <wp:extent cx="1440000" cy="1440000"/>
-            <wp:effectExtent l="0" t="0" r="8255" b="8255"/>
+            <wp:extent cx="2159635" cy="2159635"/>
+            <wp:effectExtent l="0" t="0" r="0" b="0"/>
             <wp:wrapSquare wrapText="bothSides"/>
-            <wp:docPr id="14" name="Graphic 14"/>
-            <wp:cNvGraphicFramePr>
-              <a:graphicFrameLocks xmlns:a="http://schemas.openxmlformats.org/drawingml/2006/main" noChangeAspect="1"/>
-            </wp:cNvGraphicFramePr>
-            <a:graphic xmlns:a="http://schemas.openxmlformats.org/drawingml/2006/main">
-              <a:graphicData uri="http://schemas.openxmlformats.org/drawingml/2006/picture">
-                <pic:pic xmlns:pic="http://schemas.openxmlformats.org/drawingml/2006/picture">
-                  <pic:nvPicPr>
-                    <pic:cNvPr id="1" name=""/>
-                    <pic:cNvPicPr/>
-                  </pic:nvPicPr>
-                  <pic:blipFill>
-                    <a:blip r:embed="rId11">
-                      <a:extLst>
-                        <a:ext uri="{96DAC541-7B7A-43D3-8B79-37D633B846F1}">
-                          <asvg:svgBlip xmlns:asvg="http://schemas.microsoft.com/office/drawing/2016/SVG/main" r:embed="rId12"/>
-                        </a:ext>
-                      </a:extLst>
-                    </a:blip>
-                    <a:stretch>
-                      <a:fillRect/>
-                    </a:stretch>
-                  </pic:blipFill>
-                  <pic:spPr>
-                    <a:xfrm>
-                      <a:off x="0" y="0"/>
-                      <a:ext cx="1440000" cy="1440000"/>
-                    </a:xfrm>
-                    <a:prstGeom prst="rect">
-                      <a:avLst/>
-                    </a:prstGeom>
-                  </pic:spPr>
-                </pic:pic>
-              </a:graphicData>
-            </a:graphic>
-            <wp14:sizeRelH relativeFrom="margin">
-              <wp14:pctWidth>0</wp14:pctWidth>
-            </wp14:sizeRelH>
-            <wp14:sizeRelV relativeFrom="margin">
-              <wp14:pctHeight>0</wp14:pctHeight>
-            </wp14:sizeRelV>
-          </wp:anchor>
-        </w:drawing>
-      </w:r>
-      <w:r>
-        <w:rPr>
-          <w:noProof/>
-        </w:rPr>
-        <w:drawing>
-          <wp:anchor distT="0" distB="0" distL="114300" distR="114300" simplePos="0" relativeHeight="251674624" behindDoc="0" locked="0" layoutInCell="1" allowOverlap="1" wp14:anchorId="48BA1E71" wp14:editId="495566E6">
-            <wp:simplePos x="0" y="0"/>
-            <wp:positionH relativeFrom="column">
-              <wp:posOffset>2081048</wp:posOffset>
-            </wp:positionH>
-            <wp:positionV relativeFrom="paragraph">
-              <wp:posOffset>2159876</wp:posOffset>
-            </wp:positionV>
-            <wp:extent cx="1440000" cy="1440000"/>
-            <wp:effectExtent l="0" t="0" r="8255" b="8255"/>
-            <wp:wrapSquare wrapText="bothSides"/>
-            <wp:docPr id="13" name="Graphic 13"/>
+            <wp:docPr id="1" name="Graphic 1"/>
             <wp:cNvGraphicFramePr>
               <a:graphicFrameLocks xmlns:a="http://schemas.openxmlformats.org/drawingml/2006/main" noChangeAspect="1"/>
             </wp:cNvGraphicFramePr>
@@ -589,244 +537,6 @@
                   <pic:spPr>
                     <a:xfrm>
                       <a:off x="0" y="0"/>
-                      <a:ext cx="1440000" cy="1440000"/>
-                    </a:xfrm>
-                    <a:prstGeom prst="rect">
-                      <a:avLst/>
-                    </a:prstGeom>
-                  </pic:spPr>
-                </pic:pic>
-              </a:graphicData>
-            </a:graphic>
-            <wp14:sizeRelH relativeFrom="margin">
-              <wp14:pctWidth>0</wp14:pctWidth>
-            </wp14:sizeRelH>
-            <wp14:sizeRelV relativeFrom="margin">
-              <wp14:pctHeight>0</wp14:pctHeight>
-            </wp14:sizeRelV>
-          </wp:anchor>
-        </w:drawing>
-      </w:r>
-      <w:r>
-        <w:rPr>
-          <w:noProof/>
-        </w:rPr>
-        <w:drawing>
-          <wp:anchor distT="0" distB="0" distL="114300" distR="114300" simplePos="0" relativeHeight="251673600" behindDoc="0" locked="0" layoutInCell="1" allowOverlap="1" wp14:anchorId="615C6112" wp14:editId="3DE1AB99">
-            <wp:simplePos x="0" y="0"/>
-            <wp:positionH relativeFrom="margin">
-              <wp:align>right</wp:align>
-            </wp:positionH>
-            <wp:positionV relativeFrom="paragraph">
-              <wp:posOffset>704850</wp:posOffset>
-            </wp:positionV>
-            <wp:extent cx="7711440" cy="6301740"/>
-            <wp:effectExtent l="0" t="0" r="3810" b="3810"/>
-            <wp:wrapSquare wrapText="bothSides"/>
-            <wp:docPr id="12" name="Picture 12" descr="Solid shapes and their nets - cube"/>
-            <wp:cNvGraphicFramePr>
-              <a:graphicFrameLocks xmlns:a="http://schemas.openxmlformats.org/drawingml/2006/main" noChangeAspect="1"/>
-            </wp:cNvGraphicFramePr>
-            <a:graphic xmlns:a="http://schemas.openxmlformats.org/drawingml/2006/main">
-              <a:graphicData uri="http://schemas.openxmlformats.org/drawingml/2006/picture">
-                <pic:pic xmlns:pic="http://schemas.openxmlformats.org/drawingml/2006/picture">
-                  <pic:nvPicPr>
-                    <pic:cNvPr id="0" name="Picture 1" descr="Solid shapes and their nets - cube"/>
-                    <pic:cNvPicPr>
-                      <a:picLocks noChangeAspect="1" noChangeArrowheads="1"/>
-                    </pic:cNvPicPr>
-                  </pic:nvPicPr>
-                  <pic:blipFill>
-                    <a:blip r:embed="rId10">
-                      <a:extLst>
-                        <a:ext uri="{28A0092B-C50C-407E-A947-70E740481C1C}">
-                          <a14:useLocalDpi xmlns:a14="http://schemas.microsoft.com/office/drawing/2010/main" val="0"/>
-                        </a:ext>
-                      </a:extLst>
-                    </a:blip>
-                    <a:srcRect/>
-                    <a:stretch>
-                      <a:fillRect/>
-                    </a:stretch>
-                  </pic:blipFill>
-                  <pic:spPr bwMode="auto">
-                    <a:xfrm rot="16200000">
-                      <a:off x="0" y="0"/>
-                      <a:ext cx="7711440" cy="6301740"/>
-                    </a:xfrm>
-                    <a:prstGeom prst="rect">
-                      <a:avLst/>
-                    </a:prstGeom>
-                    <a:noFill/>
-                    <a:ln>
-                      <a:noFill/>
-                    </a:ln>
-                  </pic:spPr>
-                </pic:pic>
-              </a:graphicData>
-            </a:graphic>
-            <wp14:sizeRelH relativeFrom="margin">
-              <wp14:pctWidth>0</wp14:pctWidth>
-            </wp14:sizeRelH>
-            <wp14:sizeRelV relativeFrom="margin">
-              <wp14:pctHeight>0</wp14:pctHeight>
-            </wp14:sizeRelV>
-          </wp:anchor>
-        </w:drawing>
-      </w:r>
-      <w:r>
-        <w:br w:type="page"/>
-      </w:r>
-    </w:p>
-    <w:p>
-      <w:r>
-        <w:lastRenderedPageBreak/>
-        <w:drawing>
-          <wp:anchor distT="0" distB="0" distL="114300" distR="114300" simplePos="0" relativeHeight="251662336" behindDoc="0" locked="0" layoutInCell="1" allowOverlap="1" wp14:anchorId="1EE8977F" wp14:editId="4A1A4457">
-            <wp:simplePos x="0" y="0"/>
-            <wp:positionH relativeFrom="column">
-              <wp:posOffset>3373536</wp:posOffset>
-            </wp:positionH>
-            <wp:positionV relativeFrom="paragraph">
-              <wp:posOffset>148328</wp:posOffset>
-            </wp:positionV>
-            <wp:extent cx="2160000" cy="2160000"/>
-            <wp:effectExtent l="0" t="0" r="0" b="0"/>
-            <wp:wrapSquare wrapText="bothSides"/>
-            <wp:docPr id="5" name="Graphic 5"/>
-            <wp:cNvGraphicFramePr>
-              <a:graphicFrameLocks xmlns:a="http://schemas.openxmlformats.org/drawingml/2006/main" noChangeAspect="1"/>
-            </wp:cNvGraphicFramePr>
-            <a:graphic xmlns:a="http://schemas.openxmlformats.org/drawingml/2006/main">
-              <a:graphicData uri="http://schemas.openxmlformats.org/drawingml/2006/picture">
-                <pic:pic xmlns:pic="http://schemas.openxmlformats.org/drawingml/2006/picture">
-                  <pic:nvPicPr>
-                    <pic:cNvPr id="1" name=""/>
-                    <pic:cNvPicPr/>
-                  </pic:nvPicPr>
-                  <pic:blipFill>
-                    <a:blip r:embed="rId15">
-                      <a:extLst>
-                        <a:ext uri="{96DAC541-7B7A-43D3-8B79-37D633B846F1}">
-                          <asvg:svgBlip xmlns:asvg="http://schemas.microsoft.com/office/drawing/2016/SVG/main" r:embed="rId16"/>
-                        </a:ext>
-                      </a:extLst>
-                    </a:blip>
-                    <a:stretch>
-                      <a:fillRect/>
-                    </a:stretch>
-                  </pic:blipFill>
-                  <pic:spPr>
-                    <a:xfrm>
-                      <a:off x="0" y="0"/>
-                      <a:ext cx="2160000" cy="2160000"/>
-                    </a:xfrm>
-                    <a:prstGeom prst="rect">
-                      <a:avLst/>
-                    </a:prstGeom>
-                  </pic:spPr>
-                </pic:pic>
-              </a:graphicData>
-            </a:graphic>
-            <wp14:sizeRelH relativeFrom="margin">
-              <wp14:pctWidth>0</wp14:pctWidth>
-            </wp14:sizeRelH>
-            <wp14:sizeRelV relativeFrom="margin">
-              <wp14:pctHeight>0</wp14:pctHeight>
-            </wp14:sizeRelV>
-          </wp:anchor>
-        </w:drawing>
-      </w:r>
-      <w:r>
-        <w:drawing>
-          <wp:anchor distT="0" distB="0" distL="114300" distR="114300" simplePos="0" relativeHeight="251660288" behindDoc="0" locked="0" layoutInCell="1" allowOverlap="1" wp14:anchorId="44557C8F" wp14:editId="33302E19">
-            <wp:simplePos x="0" y="0"/>
-            <wp:positionH relativeFrom="margin">
-              <wp:posOffset>315113</wp:posOffset>
-            </wp:positionH>
-            <wp:positionV relativeFrom="paragraph">
-              <wp:posOffset>5072555</wp:posOffset>
-            </wp:positionV>
-            <wp:extent cx="2160000" cy="2160000"/>
-            <wp:effectExtent l="0" t="0" r="0" b="0"/>
-            <wp:wrapSquare wrapText="bothSides"/>
-            <wp:docPr id="3" name="Graphic 3"/>
-            <wp:cNvGraphicFramePr>
-              <a:graphicFrameLocks xmlns:a="http://schemas.openxmlformats.org/drawingml/2006/main" noChangeAspect="1"/>
-            </wp:cNvGraphicFramePr>
-            <a:graphic xmlns:a="http://schemas.openxmlformats.org/drawingml/2006/main">
-              <a:graphicData uri="http://schemas.openxmlformats.org/drawingml/2006/picture">
-                <pic:pic xmlns:pic="http://schemas.openxmlformats.org/drawingml/2006/picture">
-                  <pic:nvPicPr>
-                    <pic:cNvPr id="1" name=""/>
-                    <pic:cNvPicPr/>
-                  </pic:nvPicPr>
-                  <pic:blipFill>
-                    <a:blip r:embed="rId17">
-                      <a:extLst>
-                        <a:ext uri="{96DAC541-7B7A-43D3-8B79-37D633B846F1}">
-                          <asvg:svgBlip xmlns:asvg="http://schemas.microsoft.com/office/drawing/2016/SVG/main" r:embed="rId18"/>
-                        </a:ext>
-                      </a:extLst>
-                    </a:blip>
-                    <a:stretch>
-                      <a:fillRect/>
-                    </a:stretch>
-                  </pic:blipFill>
-                  <pic:spPr>
-                    <a:xfrm>
-                      <a:off x="0" y="0"/>
-                      <a:ext cx="2160000" cy="2160000"/>
-                    </a:xfrm>
-                    <a:prstGeom prst="rect">
-                      <a:avLst/>
-                    </a:prstGeom>
-                  </pic:spPr>
-                </pic:pic>
-              </a:graphicData>
-            </a:graphic>
-          </wp:anchor>
-        </w:drawing>
-      </w:r>
-      <w:r>
-        <w:drawing>
-          <wp:anchor distT="0" distB="0" distL="114300" distR="114300" simplePos="0" relativeHeight="251658240" behindDoc="0" locked="0" layoutInCell="1" allowOverlap="1" wp14:anchorId="2F77FACB" wp14:editId="6EBB606F">
-            <wp:simplePos x="0" y="0"/>
-            <wp:positionH relativeFrom="margin">
-              <wp:posOffset>315113</wp:posOffset>
-            </wp:positionH>
-            <wp:positionV relativeFrom="paragraph">
-              <wp:posOffset>2572736</wp:posOffset>
-            </wp:positionV>
-            <wp:extent cx="2159635" cy="2159635"/>
-            <wp:effectExtent l="0" t="0" r="0" b="0"/>
-            <wp:wrapSquare wrapText="bothSides"/>
-            <wp:docPr id="1" name="Graphic 1"/>
-            <wp:cNvGraphicFramePr>
-              <a:graphicFrameLocks xmlns:a="http://schemas.openxmlformats.org/drawingml/2006/main" noChangeAspect="1"/>
-            </wp:cNvGraphicFramePr>
-            <a:graphic xmlns:a="http://schemas.openxmlformats.org/drawingml/2006/main">
-              <a:graphicData uri="http://schemas.openxmlformats.org/drawingml/2006/picture">
-                <pic:pic xmlns:pic="http://schemas.openxmlformats.org/drawingml/2006/picture">
-                  <pic:nvPicPr>
-                    <pic:cNvPr id="1" name=""/>
-                    <pic:cNvPicPr/>
-                  </pic:nvPicPr>
-                  <pic:blipFill>
-                    <a:blip r:embed="rId19">
-                      <a:extLst>
-                        <a:ext uri="{96DAC541-7B7A-43D3-8B79-37D633B846F1}">
-                          <asvg:svgBlip xmlns:asvg="http://schemas.microsoft.com/office/drawing/2016/SVG/main" r:embed="rId20"/>
-                        </a:ext>
-                      </a:extLst>
-                    </a:blip>
-                    <a:stretch>
-                      <a:fillRect/>
-                    </a:stretch>
-                  </pic:blipFill>
-                  <pic:spPr>
-                    <a:xfrm>
-                      <a:off x="0" y="0"/>
                       <a:ext cx="2159635" cy="2159635"/>
                     </a:xfrm>
                     <a:prstGeom prst="rect">
@@ -840,14 +550,17 @@
         </w:drawing>
       </w:r>
       <w:r>
+        <w:rPr>
+          <w:noProof/>
+        </w:rPr>
         <w:drawing>
-          <wp:anchor distT="0" distB="0" distL="114300" distR="114300" simplePos="0" relativeHeight="251659264" behindDoc="0" locked="0" layoutInCell="1" allowOverlap="1" wp14:anchorId="2262F0A1" wp14:editId="75AE7CAF">
+          <wp:anchor distT="0" distB="0" distL="114300" distR="114300" simplePos="0" relativeHeight="251659264" behindDoc="0" locked="0" layoutInCell="1" allowOverlap="1" wp14:anchorId="2262F0A1" wp14:editId="4AFDE0CF">
             <wp:simplePos x="0" y="0"/>
             <wp:positionH relativeFrom="margin">
-              <wp:posOffset>314960</wp:posOffset>
+              <wp:align>left</wp:align>
             </wp:positionH>
             <wp:positionV relativeFrom="paragraph">
-              <wp:posOffset>133350</wp:posOffset>
+              <wp:posOffset>7226</wp:posOffset>
             </wp:positionV>
             <wp:extent cx="2160000" cy="2160000"/>
             <wp:effectExtent l="0" t="0" r="0" b="0"/>
@@ -864,10 +577,10 @@
                     <pic:cNvPicPr/>
                   </pic:nvPicPr>
                   <pic:blipFill>
-                    <a:blip r:embed="rId21">
+                    <a:blip r:embed="rId15">
                       <a:extLst>
                         <a:ext uri="{96DAC541-7B7A-43D3-8B79-37D633B846F1}">
-                          <asvg:svgBlip xmlns:asvg="http://schemas.microsoft.com/office/drawing/2016/SVG/main" r:embed="rId22"/>
+                          <asvg:svgBlip xmlns:asvg="http://schemas.microsoft.com/office/drawing/2016/SVG/main" r:embed="rId16"/>
                         </a:ext>
                       </a:extLst>
                     </a:blip>

</xml_diff>